<commit_message>
Added gamepad support for character movement. Adjusted some of the dialogue system.
</commit_message>
<xml_diff>
--- a/ECB - GDD.docx
+++ b/ECB - GDD.docx
@@ -70,7 +70,7 @@
           <w:szCs w:val="21"/>
         </w:rPr>
         <w:pict w14:anchorId="68DFAB28">
-          <v:rect id="_x0000_i1217" style="width:0;height:1.5pt" o:hralign="center" o:hrstd="t" o:hr="t" fillcolor="#a0a0a0" stroked="f"/>
+          <v:rect id="_x0000_i1025" style="width:0;height:1.5pt" o:hralign="center" o:hrstd="t" o:hr="t" fillcolor="#a0a0a0" stroked="f"/>
         </w:pict>
       </w:r>
     </w:p>
@@ -121,7 +121,7 @@
           <w:szCs w:val="21"/>
         </w:rPr>
         <w:pict w14:anchorId="67B5FB1D">
-          <v:rect id="_x0000_i1218" style="width:0;height:1.5pt" o:hralign="center" o:hrstd="t" o:hr="t" fillcolor="#a0a0a0" stroked="f"/>
+          <v:rect id="_x0000_i1026" style="width:0;height:1.5pt" o:hralign="center" o:hrstd="t" o:hr="t" fillcolor="#a0a0a0" stroked="f"/>
         </w:pict>
       </w:r>
     </w:p>
@@ -441,7 +441,7 @@
           <w:szCs w:val="21"/>
         </w:rPr>
         <w:pict w14:anchorId="4B6F82B8">
-          <v:rect id="_x0000_i1219" style="width:0;height:1.5pt" o:hralign="center" o:hrstd="t" o:hr="t" fillcolor="#a0a0a0" stroked="f"/>
+          <v:rect id="_x0000_i1027" style="width:0;height:1.5pt" o:hralign="center" o:hrstd="t" o:hr="t" fillcolor="#a0a0a0" stroked="f"/>
         </w:pict>
       </w:r>
     </w:p>
@@ -738,7 +738,7 @@
           <w:szCs w:val="21"/>
         </w:rPr>
         <w:pict w14:anchorId="0FF69800">
-          <v:rect id="_x0000_i1220" style="width:0;height:1.5pt" o:hralign="center" o:hrstd="t" o:hr="t" fillcolor="#a0a0a0" stroked="f"/>
+          <v:rect id="_x0000_i1028" style="width:0;height:1.5pt" o:hralign="center" o:hrstd="t" o:hr="t" fillcolor="#a0a0a0" stroked="f"/>
         </w:pict>
       </w:r>
     </w:p>
@@ -918,7 +918,7 @@
           <w:szCs w:val="21"/>
         </w:rPr>
         <w:pict w14:anchorId="0231F299">
-          <v:rect id="_x0000_i1221" style="width:0;height:1.5pt" o:hralign="center" o:hrstd="t" o:hr="t" fillcolor="#a0a0a0" stroked="f"/>
+          <v:rect id="_x0000_i1029" style="width:0;height:1.5pt" o:hralign="center" o:hrstd="t" o:hr="t" fillcolor="#a0a0a0" stroked="f"/>
         </w:pict>
       </w:r>
     </w:p>
@@ -1063,7 +1063,7 @@
           <w:szCs w:val="21"/>
         </w:rPr>
         <w:pict w14:anchorId="51348CB5">
-          <v:rect id="_x0000_i1222" style="width:0;height:1.5pt" o:hralign="center" o:hrstd="t" o:hr="t" fillcolor="#a0a0a0" stroked="f"/>
+          <v:rect id="_x0000_i1030" style="width:0;height:1.5pt" o:hralign="center" o:hrstd="t" o:hr="t" fillcolor="#a0a0a0" stroked="f"/>
         </w:pict>
       </w:r>
     </w:p>
@@ -1338,7 +1338,7 @@
           <w:szCs w:val="21"/>
         </w:rPr>
         <w:pict w14:anchorId="6806CD47">
-          <v:rect id="_x0000_i1223" style="width:0;height:1.5pt" o:hralign="center" o:hrstd="t" o:hr="t" fillcolor="#a0a0a0" stroked="f"/>
+          <v:rect id="_x0000_i1031" style="width:0;height:1.5pt" o:hralign="center" o:hrstd="t" o:hr="t" fillcolor="#a0a0a0" stroked="f"/>
         </w:pict>
       </w:r>
     </w:p>
@@ -1498,7 +1498,7 @@
           <w:szCs w:val="21"/>
         </w:rPr>
         <w:pict w14:anchorId="67FDFF3F">
-          <v:rect id="_x0000_i1224" style="width:0;height:1.5pt" o:hralign="center" o:hrstd="t" o:hr="t" fillcolor="#a0a0a0" stroked="f"/>
+          <v:rect id="_x0000_i1032" style="width:0;height:1.5pt" o:hralign="center" o:hrstd="t" o:hr="t" fillcolor="#a0a0a0" stroked="f"/>
         </w:pict>
       </w:r>
     </w:p>
@@ -1586,7 +1586,16 @@
           <w:sz w:val="21"/>
           <w:szCs w:val="21"/>
         </w:rPr>
-        <w:t>Create the Dialogue System</w:t>
+        <w:t>Refine</w:t>
+      </w:r>
+      <w:r>
+        <w:rPr>
+          <w:b/>
+          <w:bCs/>
+          <w:sz w:val="21"/>
+          <w:szCs w:val="21"/>
+        </w:rPr>
+        <w:t xml:space="preserve"> the Dialogue System</w:t>
       </w:r>
       <w:r>
         <w:rPr>
@@ -1612,7 +1621,7 @@
           <w:sz w:val="21"/>
           <w:szCs w:val="21"/>
         </w:rPr>
-        <w:t>Implement the dialogue system with floating dialogue boxes.</w:t>
+        <w:t>Switch player to chatting state when in dialague and restrict their movement and actions.</w:t>
       </w:r>
     </w:p>
     <w:p>
@@ -1652,6 +1661,7 @@
           <w:sz w:val="21"/>
           <w:szCs w:val="21"/>
         </w:rPr>
+        <w:lastRenderedPageBreak/>
         <w:t>Implement Gamepad Support</w:t>
       </w:r>
       <w:r>
@@ -1678,7 +1688,6 @@
           <w:sz w:val="21"/>
           <w:szCs w:val="21"/>
         </w:rPr>
-        <w:lastRenderedPageBreak/>
         <w:t>Set up gamepad controls for movement, jumping, and object interaction.</w:t>
       </w:r>
     </w:p>
@@ -1714,7 +1723,7 @@
           <w:szCs w:val="21"/>
         </w:rPr>
         <w:pict w14:anchorId="163607A7">
-          <v:rect id="_x0000_i1225" style="width:0;height:1.5pt" o:hralign="center" o:hrstd="t" o:hr="t" fillcolor="#a0a0a0" stroked="f"/>
+          <v:rect id="_x0000_i1033" style="width:0;height:1.5pt" o:hralign="center" o:hrstd="t" o:hr="t" fillcolor="#a0a0a0" stroked="f"/>
         </w:pict>
       </w:r>
     </w:p>
@@ -1858,7 +1867,7 @@
           <w:szCs w:val="21"/>
         </w:rPr>
         <w:pict w14:anchorId="31D05D7F">
-          <v:rect id="_x0000_i1226" style="width:0;height:1.5pt" o:hralign="center" o:hrstd="t" o:hr="t" fillcolor="#a0a0a0" stroked="f"/>
+          <v:rect id="_x0000_i1034" style="width:0;height:1.5pt" o:hralign="center" o:hrstd="t" o:hr="t" fillcolor="#a0a0a0" stroked="f"/>
         </w:pict>
       </w:r>
     </w:p>
@@ -1986,23 +1995,7 @@
           <w:szCs w:val="21"/>
         </w:rPr>
         <w:br/>
-        <w:t xml:space="preserve">Test the core gameplay and vertical </w:t>
-      </w:r>
-      <w:proofErr w:type="gramStart"/>
-      <w:r>
-        <w:rPr>
-          <w:sz w:val="21"/>
-          <w:szCs w:val="21"/>
-        </w:rPr>
-        <w:t>slice, and</w:t>
-      </w:r>
-      <w:proofErr w:type="gramEnd"/>
-      <w:r>
-        <w:rPr>
-          <w:sz w:val="21"/>
-          <w:szCs w:val="21"/>
-        </w:rPr>
-        <w:t xml:space="preserve"> adjust based on feedback.</w:t>
+        <w:t>Test the core gameplay and vertical slice, and adjust based on feedback.</w:t>
       </w:r>
     </w:p>
     <w:p>
@@ -4607,6 +4600,7 @@
   <w:style w:type="character" w:default="1" w:styleId="DefaultParagraphFont">
     <w:name w:val="Default Paragraph Font"/>
     <w:uiPriority w:val="1"/>
+    <w:semiHidden/>
     <w:unhideWhenUsed/>
   </w:style>
   <w:style w:type="table" w:default="1" w:styleId="TableNormal">

</xml_diff>